<commit_message>
feat: implement asset management module and infrastructure for HR and inventory tracking
</commit_message>
<xml_diff>
--- a/backend/app/assets/hr_letters/appointment-template.docx
+++ b/backend/app/assets/hr_letters/appointment-template.docx
@@ -5390,527 +5390,10 @@
       </w:pPr>
       <w:r>
         <w:rPr>
-          <w:rFonts w:ascii="Nirmala UI" w:eastAsia="Arial MT" w:hAnsi="Nirmala UI" w:cs="Nirmala UI"/>
-          <w:kern w:val="0"/>
-          <w:sz w:val="20"/>
-          <w:szCs w:val="20"/>
-          <w:lang w:val="en-US"/>
-        </w:rPr>
-        <w:t>ಪರಿಹಾರ</w:t>
-      </w:r>
-      <w:r>
-        <w:rPr>
-          <w:rFonts w:ascii="Arial MT" w:eastAsia="Arial MT" w:hAnsi="Arial MT" w:cs="Arial MT"/>
-          <w:kern w:val="0"/>
-          <w:sz w:val="20"/>
-          <w:szCs w:val="20"/>
-          <w:lang w:val="en-US"/>
-        </w:rPr>
-        <w:t xml:space="preserve">: </w:t>
-      </w:r>
-      <w:r>
-        <w:rPr>
-          <w:rFonts w:ascii="Nirmala UI" w:eastAsia="Arial MT" w:hAnsi="Nirmala UI" w:cs="Nirmala UI"/>
-          <w:kern w:val="0"/>
-          <w:sz w:val="20"/>
-          <w:szCs w:val="20"/>
-          <w:lang w:val="en-US"/>
-        </w:rPr>
-        <w:t>ನೀವು</w:t>
-      </w:r>
-      <w:r>
-        <w:rPr>
-          <w:rFonts w:ascii="Arial MT" w:eastAsia="Arial MT" w:hAnsi="Arial MT" w:cs="Arial MT"/>
-          <w:kern w:val="0"/>
-          <w:sz w:val="20"/>
-          <w:szCs w:val="20"/>
-          <w:lang w:val="en-US"/>
-        </w:rPr>
-        <w:t xml:space="preserve"> </w:t>
-      </w:r>
-      <w:r>
-        <w:rPr>
-          <w:rFonts w:ascii="Nirmala UI" w:eastAsia="Arial MT" w:hAnsi="Nirmala UI" w:cs="Nirmala UI"/>
-          <w:kern w:val="0"/>
-          <w:sz w:val="20"/>
-          <w:szCs w:val="20"/>
-          <w:lang w:val="en-US"/>
-        </w:rPr>
-        <w:t>ರೂ</w:t>
-      </w:r>
-      <w:r>
-        <w:rPr>
-          <w:rFonts w:ascii="Arial MT" w:eastAsia="Arial MT" w:hAnsi="Arial MT" w:cs="Arial MT"/>
-          <w:kern w:val="0"/>
-          <w:sz w:val="20"/>
-          <w:szCs w:val="20"/>
-          <w:lang w:val="en-US"/>
-        </w:rPr>
-        <w:t xml:space="preserve"> </w:t>
-      </w:r>
-      <w:r>
-        <w:rPr>
-          <w:rFonts w:ascii="Nirmala UI" w:eastAsia="Arial MT" w:hAnsi="Nirmala UI" w:cs="Nirmala UI"/>
-          <w:kern w:val="0"/>
-          <w:sz w:val="20"/>
-          <w:szCs w:val="20"/>
-          <w:lang w:val="en-US"/>
-        </w:rPr>
-        <w:t>ಒಟ್ಟು</w:t>
-      </w:r>
-      <w:r>
-        <w:rPr>
-          <w:rFonts w:ascii="Arial MT" w:eastAsia="Arial MT" w:hAnsi="Arial MT" w:cs="Arial MT"/>
-          <w:kern w:val="0"/>
-          <w:sz w:val="20"/>
-          <w:szCs w:val="20"/>
-          <w:lang w:val="en-US"/>
-        </w:rPr>
-        <w:t xml:space="preserve"> </w:t>
-      </w:r>
-      <w:r>
-        <w:rPr>
-          <w:rFonts w:ascii="Nirmala UI" w:eastAsia="Arial MT" w:hAnsi="Nirmala UI" w:cs="Nirmala UI"/>
-          <w:kern w:val="0"/>
-          <w:sz w:val="20"/>
-          <w:szCs w:val="20"/>
-          <w:lang w:val="en-US"/>
-        </w:rPr>
-        <w:t>ವೇತನವನ್ನು</w:t>
-      </w:r>
-      <w:r>
-        <w:rPr>
-          <w:rFonts w:ascii="Arial MT" w:eastAsia="Arial MT" w:hAnsi="Arial MT" w:cs="Arial MT"/>
-          <w:kern w:val="0"/>
-          <w:sz w:val="20"/>
-          <w:szCs w:val="20"/>
-          <w:lang w:val="en-US"/>
-        </w:rPr>
-        <w:t xml:space="preserve"> </w:t>
-      </w:r>
-      <w:r>
-        <w:rPr>
-          <w:rFonts w:ascii="Nirmala UI" w:eastAsia="Arial MT" w:hAnsi="Nirmala UI" w:cs="Nirmala UI"/>
-          <w:kern w:val="0"/>
-          <w:sz w:val="20"/>
-          <w:szCs w:val="20"/>
-          <w:lang w:val="en-US"/>
-        </w:rPr>
-        <w:t>ಪಡೆಯುತ್ತೀರಿ</w:t>
-      </w:r>
-      <w:r>
-        <w:rPr>
-          <w:rFonts w:ascii="Arial MT" w:eastAsia="Arial MT" w:hAnsi="Arial MT" w:cs="Arial MT"/>
-          <w:kern w:val="0"/>
-          <w:sz w:val="20"/>
-          <w:szCs w:val="20"/>
-          <w:lang w:val="en-US"/>
-        </w:rPr>
-        <w:t xml:space="preserve">. </w:t>
-      </w:r>
-      <w:r>
-        <w:rPr>
-          <w:rFonts w:ascii="Arial MT" w:eastAsia="Arial MT" w:hAnsi="Arial MT" w:cs="Arial MT"/>
-          <w:kern w:val="0"/>
-          <w:sz w:val="20"/>
-          <w:szCs w:val="20"/>
-          <w:u w:val="single"/>
-          <w:lang w:val="en-US"/>
-        </w:rPr>
-        <w:t>{{gross_salary}}</w:t>
-      </w:r>
-      <w:r>
-        <w:rPr>
-          <w:rFonts w:ascii="Arial MT" w:eastAsia="Arial MT" w:hAnsi="Arial MT" w:cs="Arial MT"/>
-          <w:kern w:val="0"/>
-          <w:sz w:val="20"/>
-          <w:szCs w:val="20"/>
-          <w:lang w:val="en-US"/>
-        </w:rPr>
-        <w:t xml:space="preserve"> (</w:t>
-      </w:r>
-      <w:r>
-        <w:rPr>
-          <w:rFonts w:ascii="Nirmala UI" w:eastAsia="Arial MT" w:hAnsi="Nirmala UI" w:cs="Nirmala UI"/>
-          <w:kern w:val="0"/>
-          <w:sz w:val="20"/>
-          <w:szCs w:val="20"/>
-          <w:u w:val="single"/>
-          <w:lang w:val="en-US"/>
-        </w:rPr>
-        <w:t xml:space="preserve">ರೂಪಾಯಿಗಳು </w:t>
-      </w:r>
-      <w:r>
-        <w:rPr>
-          <w:rFonts w:ascii="Nirmala UI" w:eastAsia="Arial MT" w:hAnsi="Nirmala UI" w:cs="Nirmala UI" w:hint="cs"/>
-          <w:kern w:val="0"/>
-          <w:sz w:val="20"/>
-          <w:szCs w:val="20"/>
-          <w:u w:val="single"/>
-        </w:rPr>
-        <w:t>{{gross_salary_words_kannada}}</w:t>
-      </w:r>
-      <w:r>
-        <w:rPr>
-          <w:rFonts w:ascii="Nirmala UI" w:eastAsia="Arial MT" w:hAnsi="Nirmala UI" w:cs="Nirmala UI"/>
-          <w:kern w:val="0"/>
-          <w:sz w:val="20"/>
-          <w:szCs w:val="20"/>
-          <w:u w:val="single"/>
-        </w:rPr>
-      </w:r>
-      <w:r>
-        <w:rPr>
-          <w:rFonts w:ascii="Nirmala UI" w:eastAsia="Arial MT" w:hAnsi="Nirmala UI" w:cs="Nirmala UI"/>
-          <w:kern w:val="0"/>
-          <w:sz w:val="20"/>
-          <w:szCs w:val="20"/>
-          <w:u w:val="single"/>
-          <w:lang w:val="en-US" w:bidi="kn-IN"/>
-        </w:rPr>
-      </w:r>
-      <w:r>
-        <w:rPr>
-          <w:rFonts w:ascii="Nirmala UI" w:eastAsia="Arial MT" w:hAnsi="Nirmala UI" w:cs="Nirmala UI"/>
-          <w:kern w:val="0"/>
-          <w:sz w:val="20"/>
-          <w:szCs w:val="20"/>
-          <w:u w:val="single"/>
-          <w:lang w:val="en-US"/>
-        </w:rPr>
-        <w:t>ರೂಪಾಯಿಗಳು</w:t>
-      </w:r>
-      <w:r>
-        <w:rPr>
-          <w:rFonts w:ascii="Arial MT" w:eastAsia="Arial MT" w:hAnsi="Arial MT" w:cs="Arial MT"/>
-          <w:kern w:val="0"/>
-          <w:sz w:val="20"/>
-          <w:szCs w:val="20"/>
-          <w:u w:val="single"/>
-          <w:lang w:val="en-US"/>
-        </w:rPr>
-        <w:t xml:space="preserve"> </w:t>
-      </w:r>
-      <w:r>
-        <w:rPr>
-          <w:rFonts w:ascii="Nirmala UI" w:eastAsia="Arial MT" w:hAnsi="Nirmala UI" w:cs="Nirmala UI"/>
-          <w:kern w:val="0"/>
-          <w:sz w:val="20"/>
-          <w:szCs w:val="20"/>
-          <w:u w:val="single"/>
-          <w:lang w:val="en-US"/>
-        </w:rPr>
-        <w:t>ಮಾತ್ರ</w:t>
-      </w:r>
-      <w:r>
-        <w:rPr>
-          <w:rFonts w:ascii="Arial MT" w:eastAsia="Arial MT" w:hAnsi="Arial MT" w:cs="Arial MT"/>
-          <w:kern w:val="0"/>
-          <w:sz w:val="20"/>
-          <w:szCs w:val="20"/>
-          <w:lang w:val="en-US"/>
-        </w:rPr>
-        <w:t xml:space="preserve">) </w:t>
-      </w:r>
-      <w:r>
-        <w:rPr>
-          <w:rFonts w:ascii="Nirmala UI" w:eastAsia="Arial MT" w:hAnsi="Nirmala UI" w:cs="Nirmala UI"/>
-          <w:kern w:val="0"/>
-          <w:sz w:val="20"/>
-          <w:szCs w:val="20"/>
-          <w:lang w:val="en-US"/>
-        </w:rPr>
-        <w:t>ಇದು</w:t>
-      </w:r>
-      <w:r>
-        <w:rPr>
-          <w:rFonts w:ascii="Arial MT" w:eastAsia="Arial MT" w:hAnsi="Arial MT" w:cs="Arial MT"/>
-          <w:kern w:val="0"/>
-          <w:sz w:val="20"/>
-          <w:szCs w:val="20"/>
-          <w:lang w:val="en-US"/>
-        </w:rPr>
-        <w:t xml:space="preserve"> </w:t>
-      </w:r>
-      <w:r>
-        <w:rPr>
-          <w:rFonts w:ascii="Nirmala UI" w:eastAsia="Arial MT" w:hAnsi="Nirmala UI" w:cs="Nirmala UI"/>
-          <w:kern w:val="0"/>
-          <w:sz w:val="20"/>
-          <w:szCs w:val="20"/>
-          <w:lang w:val="en-US"/>
-        </w:rPr>
-        <w:t>ಆದಾಯ</w:t>
-      </w:r>
-      <w:r>
-        <w:rPr>
-          <w:rFonts w:ascii="Arial MT" w:eastAsia="Arial MT" w:hAnsi="Arial MT" w:cs="Arial MT"/>
-          <w:kern w:val="0"/>
-          <w:sz w:val="20"/>
-          <w:szCs w:val="20"/>
-          <w:lang w:val="en-US"/>
-        </w:rPr>
-        <w:t xml:space="preserve"> </w:t>
-      </w:r>
-      <w:r>
-        <w:rPr>
-          <w:rFonts w:ascii="Nirmala UI" w:eastAsia="Arial MT" w:hAnsi="Nirmala UI" w:cs="Nirmala UI"/>
-          <w:kern w:val="0"/>
-          <w:sz w:val="20"/>
-          <w:szCs w:val="20"/>
-          <w:lang w:val="en-US"/>
-        </w:rPr>
-        <w:t>ತೆರಿಗೆ</w:t>
-      </w:r>
-      <w:r>
-        <w:rPr>
-          <w:rFonts w:ascii="Arial MT" w:eastAsia="Arial MT" w:hAnsi="Arial MT" w:cs="Arial MT"/>
-          <w:kern w:val="0"/>
-          <w:sz w:val="20"/>
-          <w:szCs w:val="20"/>
-          <w:lang w:val="en-US"/>
-        </w:rPr>
-        <w:t xml:space="preserve"> </w:t>
-      </w:r>
-      <w:r>
-        <w:rPr>
-          <w:rFonts w:ascii="Nirmala UI" w:eastAsia="Arial MT" w:hAnsi="Nirmala UI" w:cs="Nirmala UI"/>
-          <w:kern w:val="0"/>
-          <w:sz w:val="20"/>
-          <w:szCs w:val="20"/>
-          <w:lang w:val="en-US"/>
-        </w:rPr>
-        <w:t>ಕಾಯಿದೆ</w:t>
-      </w:r>
-      <w:r>
-        <w:rPr>
-          <w:rFonts w:ascii="Arial MT" w:eastAsia="Arial MT" w:hAnsi="Arial MT" w:cs="Arial MT"/>
-          <w:kern w:val="0"/>
-          <w:sz w:val="20"/>
-          <w:szCs w:val="20"/>
-          <w:lang w:val="en-US"/>
-        </w:rPr>
-        <w:t xml:space="preserve"> </w:t>
-      </w:r>
-      <w:r>
-        <w:rPr>
-          <w:rFonts w:ascii="Nirmala UI" w:eastAsia="Arial MT" w:hAnsi="Nirmala UI" w:cs="Nirmala UI"/>
-          <w:kern w:val="0"/>
-          <w:sz w:val="20"/>
-          <w:szCs w:val="20"/>
-          <w:lang w:val="en-US"/>
-        </w:rPr>
-        <w:t>ಮತ್ತು</w:t>
-      </w:r>
-      <w:r>
-        <w:rPr>
-          <w:rFonts w:ascii="Arial MT" w:eastAsia="Arial MT" w:hAnsi="Arial MT" w:cs="Arial MT"/>
-          <w:kern w:val="0"/>
-          <w:sz w:val="20"/>
-          <w:szCs w:val="20"/>
-          <w:lang w:val="en-US"/>
-        </w:rPr>
-        <w:t xml:space="preserve"> </w:t>
-      </w:r>
-      <w:r>
-        <w:rPr>
-          <w:rFonts w:ascii="Nirmala UI" w:eastAsia="Arial MT" w:hAnsi="Nirmala UI" w:cs="Nirmala UI"/>
-          <w:kern w:val="0"/>
-          <w:sz w:val="20"/>
-          <w:szCs w:val="20"/>
-          <w:lang w:val="en-US"/>
-        </w:rPr>
-        <w:t>ಅನ್ವಯವಾಗುವ</w:t>
-      </w:r>
-      <w:r>
-        <w:rPr>
-          <w:rFonts w:ascii="Arial MT" w:eastAsia="Arial MT" w:hAnsi="Arial MT" w:cs="Arial MT"/>
-          <w:kern w:val="0"/>
-          <w:sz w:val="20"/>
-          <w:szCs w:val="20"/>
-          <w:lang w:val="en-US"/>
-        </w:rPr>
-        <w:t xml:space="preserve"> </w:t>
-      </w:r>
-      <w:r>
-        <w:rPr>
-          <w:rFonts w:ascii="Nirmala UI" w:eastAsia="Arial MT" w:hAnsi="Nirmala UI" w:cs="Nirmala UI"/>
-          <w:kern w:val="0"/>
-          <w:sz w:val="20"/>
-          <w:szCs w:val="20"/>
-          <w:lang w:val="en-US"/>
-        </w:rPr>
-        <w:t>ಯಾವುದೇ</w:t>
-      </w:r>
-      <w:r>
-        <w:rPr>
-          <w:rFonts w:ascii="Arial MT" w:eastAsia="Arial MT" w:hAnsi="Arial MT" w:cs="Arial MT"/>
-          <w:kern w:val="0"/>
-          <w:sz w:val="20"/>
-          <w:szCs w:val="20"/>
-          <w:lang w:val="en-US"/>
-        </w:rPr>
-        <w:t xml:space="preserve"> </w:t>
-      </w:r>
-      <w:r>
-        <w:rPr>
-          <w:rFonts w:ascii="Nirmala UI" w:eastAsia="Arial MT" w:hAnsi="Nirmala UI" w:cs="Nirmala UI"/>
-          <w:kern w:val="0"/>
-          <w:sz w:val="20"/>
-          <w:szCs w:val="20"/>
-          <w:lang w:val="en-US"/>
-        </w:rPr>
-        <w:t>ಇತರ</w:t>
-      </w:r>
-      <w:r>
-        <w:rPr>
-          <w:rFonts w:ascii="Arial MT" w:eastAsia="Arial MT" w:hAnsi="Arial MT" w:cs="Arial MT"/>
-          <w:kern w:val="0"/>
-          <w:sz w:val="20"/>
-          <w:szCs w:val="20"/>
-          <w:lang w:val="en-US"/>
-        </w:rPr>
-        <w:t xml:space="preserve"> </w:t>
-      </w:r>
-      <w:r>
-        <w:rPr>
-          <w:rFonts w:ascii="Nirmala UI" w:eastAsia="Arial MT" w:hAnsi="Nirmala UI" w:cs="Nirmala UI"/>
-          <w:kern w:val="0"/>
-          <w:sz w:val="20"/>
-          <w:szCs w:val="20"/>
-          <w:lang w:val="en-US"/>
-        </w:rPr>
-        <w:t>ಶಾಸನಬದ್ಧ</w:t>
-      </w:r>
-      <w:r>
-        <w:rPr>
-          <w:rFonts w:ascii="Arial MT" w:eastAsia="Arial MT" w:hAnsi="Arial MT" w:cs="Arial MT"/>
-          <w:kern w:val="0"/>
-          <w:sz w:val="20"/>
-          <w:szCs w:val="20"/>
-          <w:lang w:val="en-US"/>
-        </w:rPr>
-        <w:t xml:space="preserve"> </w:t>
-      </w:r>
-      <w:r>
-        <w:rPr>
-          <w:rFonts w:ascii="Nirmala UI" w:eastAsia="Arial MT" w:hAnsi="Nirmala UI" w:cs="Nirmala UI"/>
-          <w:kern w:val="0"/>
-          <w:sz w:val="20"/>
-          <w:szCs w:val="20"/>
-          <w:lang w:val="en-US"/>
-        </w:rPr>
-        <w:t>ಕಡಿತಕ್ಕೆ</w:t>
-      </w:r>
-      <w:r>
-        <w:rPr>
-          <w:rFonts w:ascii="Arial MT" w:eastAsia="Arial MT" w:hAnsi="Arial MT" w:cs="Arial MT"/>
-          <w:kern w:val="0"/>
-          <w:sz w:val="20"/>
-          <w:szCs w:val="20"/>
-          <w:lang w:val="en-US"/>
-        </w:rPr>
-        <w:t xml:space="preserve"> </w:t>
-      </w:r>
-      <w:r>
-        <w:rPr>
-          <w:rFonts w:ascii="Nirmala UI" w:eastAsia="Arial MT" w:hAnsi="Nirmala UI" w:cs="Nirmala UI"/>
-          <w:kern w:val="0"/>
-          <w:sz w:val="20"/>
-          <w:szCs w:val="20"/>
-          <w:lang w:val="en-US"/>
-        </w:rPr>
-        <w:t>ಅನುಸಾರವಾಗಿ</w:t>
-      </w:r>
-      <w:r>
-        <w:rPr>
-          <w:rFonts w:ascii="Arial MT" w:eastAsia="Arial MT" w:hAnsi="Arial MT" w:cs="Arial MT"/>
-          <w:kern w:val="0"/>
-          <w:sz w:val="20"/>
-          <w:szCs w:val="20"/>
-          <w:lang w:val="en-US"/>
-        </w:rPr>
-        <w:t xml:space="preserve"> </w:t>
-      </w:r>
-      <w:r>
-        <w:rPr>
-          <w:rFonts w:ascii="Nirmala UI" w:eastAsia="Arial MT" w:hAnsi="Nirmala UI" w:cs="Nirmala UI"/>
-          <w:kern w:val="0"/>
-          <w:sz w:val="20"/>
-          <w:szCs w:val="20"/>
-          <w:lang w:val="en-US"/>
-        </w:rPr>
-        <w:t>ಮೂಲದಲ್ಲಿ</w:t>
-      </w:r>
-      <w:r>
-        <w:rPr>
-          <w:rFonts w:ascii="Arial MT" w:eastAsia="Arial MT" w:hAnsi="Arial MT" w:cs="Arial MT"/>
-          <w:kern w:val="0"/>
-          <w:sz w:val="20"/>
-          <w:szCs w:val="20"/>
-          <w:lang w:val="en-US"/>
-        </w:rPr>
-        <w:t xml:space="preserve"> </w:t>
-      </w:r>
-      <w:r>
-        <w:rPr>
-          <w:rFonts w:ascii="Nirmala UI" w:eastAsia="Arial MT" w:hAnsi="Nirmala UI" w:cs="Nirmala UI"/>
-          <w:kern w:val="0"/>
-          <w:sz w:val="20"/>
-          <w:szCs w:val="20"/>
-          <w:lang w:val="en-US"/>
-        </w:rPr>
-        <w:t>ತೆರಿಗೆ</w:t>
-      </w:r>
-      <w:r>
-        <w:rPr>
-          <w:rFonts w:ascii="Arial MT" w:eastAsia="Arial MT" w:hAnsi="Arial MT" w:cs="Arial MT"/>
-          <w:kern w:val="0"/>
-          <w:sz w:val="20"/>
-          <w:szCs w:val="20"/>
-          <w:lang w:val="en-US"/>
-        </w:rPr>
-        <w:t xml:space="preserve"> </w:t>
-      </w:r>
-      <w:r>
-        <w:rPr>
-          <w:rFonts w:ascii="Nirmala UI" w:eastAsia="Arial MT" w:hAnsi="Nirmala UI" w:cs="Nirmala UI"/>
-          <w:kern w:val="0"/>
-          <w:sz w:val="20"/>
-          <w:szCs w:val="20"/>
-          <w:lang w:val="en-US"/>
-        </w:rPr>
-        <w:t>ಕಡಿತಕ್ಕೆ</w:t>
-      </w:r>
-      <w:r>
-        <w:rPr>
-          <w:rFonts w:ascii="Arial MT" w:eastAsia="Arial MT" w:hAnsi="Arial MT" w:cs="Arial MT"/>
-          <w:kern w:val="0"/>
-          <w:sz w:val="20"/>
-          <w:szCs w:val="20"/>
-          <w:lang w:val="en-US"/>
-        </w:rPr>
-        <w:t xml:space="preserve"> </w:t>
-      </w:r>
-      <w:r>
-        <w:rPr>
-          <w:rFonts w:ascii="Nirmala UI" w:eastAsia="Arial MT" w:hAnsi="Nirmala UI" w:cs="Nirmala UI"/>
-          <w:kern w:val="0"/>
-          <w:sz w:val="20"/>
-          <w:szCs w:val="20"/>
-          <w:lang w:val="en-US"/>
-        </w:rPr>
-        <w:t>ಒಳಪಟ್ಟಿರುತ್ತದೆ</w:t>
-      </w:r>
-      <w:r>
-        <w:rPr>
-          <w:rFonts w:ascii="Arial MT" w:eastAsia="Arial MT" w:hAnsi="Arial MT" w:cs="Arial MT"/>
-          <w:kern w:val="0"/>
-          <w:sz w:val="20"/>
-          <w:szCs w:val="20"/>
-          <w:lang w:val="en-US"/>
-        </w:rPr>
-        <w:t>.</w:t>
+          <w:rFonts w:ascii="Nirmala UI" w:hAnsi="Nirmala UI" w:eastAsia="Nirmala UI" w:cs="Nirmala UI"/>
+          <w:sz w:val="22"/>
+        </w:rPr>
+        <w:t>ಪರಿಹಾರ: ನೀವು ರೂ. {{gross_salary}} ({{gross_salary_words_kannada}}) ಒಟ್ಟು ಮಾಸಿಕ ವೇತನವನ್ನು ಪಡೆಯುತ್ತೀರಿ. ಆದಾಯ ತೆರಿಗೆ ಕಾಯ್ದೆ ಮತ್ತು ಅನ್ವಯವಾಗುವ ಇತರ ಶಾಸನಬದ್ಧ ಕಡಿತಗಳಿಗೆ ಅನುಸಾರವಾಗಿ ಮೂಲದಲ್ಲೇ ತೆರಿಗೆ ಕಡಿತಗೊಳಿಸಲಾಗುತ್ತದೆ.</w:t>
       </w:r>
     </w:p>
     <w:p>
@@ -28753,220 +28236,6 @@
             </w:pPr>
             <w:r>
               <w:t>{{salary_b_employee_retiral_total_annual}}</w:t>
-            </w:r>
-          </w:p>
-        </w:tc>
-      </w:tr>
-      <w:tr>
-        <w:trPr>
-          <w:trHeight w:val="288"/>
-        </w:trPr>
-        <w:tc>
-          <w:tcPr>
-            <w:tcW w:w="5735" w:type="dxa"/>
-            <w:tcBorders>
-              <w:top w:val="nil"/>
-              <w:left w:val="single" w:sz="8" w:space="0" w:color="auto"/>
-              <w:bottom w:val="single" w:sz="4" w:space="0" w:color="auto"/>
-              <w:right w:val="single" w:sz="4" w:space="0" w:color="auto"/>
-            </w:tcBorders>
-            <w:noWrap/>
-            <w:vAlign w:val="center"/>
-            <w:hideMark/>
-          </w:tcPr>
-          <w:p>
-            <w:pPr>
-              <w:spacing w:after="0" w:line="240" w:lineRule="auto"/>
-              <w:rPr>
-                <w:rFonts w:ascii="Calibri" w:eastAsia="Times New Roman" w:hAnsi="Calibri" w:cs="Calibri"/>
-                <w:color w:val="000000"/>
-                <w:kern w:val="0"/>
-                <w:sz w:val="22"/>
-                <w:szCs w:val="22"/>
-                <w:lang w:eastAsia="en-IN"/>
-                <w14:ligatures w14:val="none"/>
-              </w:rPr>
-            </w:pPr>
-            <w:r>
-              <w:rPr>
-                <w:rFonts w:ascii="Calibri" w:eastAsia="Times New Roman" w:hAnsi="Calibri" w:cs="Calibri"/>
-                <w:color w:val="000000"/>
-                <w:kern w:val="0"/>
-                <w:sz w:val="22"/>
-                <w:szCs w:val="22"/>
-                <w:lang w:eastAsia="en-IN"/>
-                <w14:ligatures w14:val="none"/>
-              </w:rPr>
-              <w:t>Residential Telephone Reimbursement*</w:t>
-            </w:r>
-          </w:p>
-        </w:tc>
-        <w:tc>
-          <w:tcPr>
-            <w:tcW w:w="1961" w:type="dxa"/>
-            <w:tcBorders>
-              <w:top w:val="nil"/>
-              <w:left w:val="nil"/>
-              <w:bottom w:val="single" w:sz="4" w:space="0" w:color="auto"/>
-              <w:right w:val="single" w:sz="4" w:space="0" w:color="auto"/>
-            </w:tcBorders>
-            <w:noWrap/>
-            <w:vAlign w:val="center"/>
-          </w:tcPr>
-          <w:p>
-            <w:pPr>
-              <w:spacing w:after="0" w:line="240" w:lineRule="auto"/>
-              <w:jc w:val="center"/>
-              <w:rPr>
-                <w:rFonts w:ascii="Calibri" w:eastAsia="Times New Roman" w:hAnsi="Calibri" w:cs="Calibri"/>
-                <w:color w:val="000000"/>
-                <w:kern w:val="0"/>
-                <w:sz w:val="22"/>
-                <w:szCs w:val="22"/>
-                <w:lang w:eastAsia="en-IN"/>
-                <w14:ligatures w14:val="none"/>
-              </w:rPr>
-            </w:pPr>
-            <w:r>
-              <w:t>{{salary_residential_telephone_reimbursement_monthly}}</w:t>
-            </w:r>
-          </w:p>
-        </w:tc>
-        <w:tc>
-          <w:tcPr>
-            <w:tcW w:w="1940" w:type="dxa"/>
-            <w:tcBorders>
-              <w:top w:val="nil"/>
-              <w:left w:val="nil"/>
-              <w:bottom w:val="single" w:sz="4" w:space="0" w:color="auto"/>
-              <w:right w:val="single" w:sz="8" w:space="0" w:color="auto"/>
-            </w:tcBorders>
-            <w:noWrap/>
-            <w:vAlign w:val="center"/>
-          </w:tcPr>
-          <w:p>
-            <w:pPr>
-              <w:spacing w:after="0" w:line="240" w:lineRule="auto"/>
-              <w:jc w:val="center"/>
-              <w:rPr>
-                <w:rFonts w:ascii="Calibri" w:eastAsia="Times New Roman" w:hAnsi="Calibri" w:cs="Calibri"/>
-                <w:color w:val="000000"/>
-                <w:kern w:val="0"/>
-                <w:sz w:val="22"/>
-                <w:szCs w:val="22"/>
-                <w:lang w:eastAsia="en-IN"/>
-                <w14:ligatures w14:val="none"/>
-              </w:rPr>
-            </w:pPr>
-            <w:r>
-              <w:t>{{salary_residential_telephone_reimbursement_annual}}</w:t>
-            </w:r>
-          </w:p>
-        </w:tc>
-      </w:tr>
-      <w:tr>
-        <w:trPr>
-          <w:trHeight w:val="302"/>
-        </w:trPr>
-        <w:tc>
-          <w:tcPr>
-            <w:tcW w:w="5735" w:type="dxa"/>
-            <w:tcBorders>
-              <w:top w:val="nil"/>
-              <w:left w:val="single" w:sz="8" w:space="0" w:color="auto"/>
-              <w:bottom w:val="nil"/>
-              <w:right w:val="single" w:sz="4" w:space="0" w:color="auto"/>
-            </w:tcBorders>
-            <w:noWrap/>
-            <w:vAlign w:val="center"/>
-            <w:hideMark/>
-          </w:tcPr>
-          <w:p>
-            <w:pPr>
-              <w:spacing w:after="0" w:line="240" w:lineRule="auto"/>
-              <w:rPr>
-                <w:rFonts w:ascii="Calibri" w:eastAsia="Times New Roman" w:hAnsi="Calibri" w:cs="Calibri"/>
-                <w:color w:val="000000"/>
-                <w:kern w:val="0"/>
-                <w:sz w:val="22"/>
-                <w:szCs w:val="22"/>
-                <w:lang w:eastAsia="en-IN"/>
-                <w14:ligatures w14:val="none"/>
-              </w:rPr>
-            </w:pPr>
-            <w:r>
-              <w:rPr>
-                <w:rFonts w:ascii="Calibri" w:eastAsia="Times New Roman" w:hAnsi="Calibri" w:cs="Calibri"/>
-                <w:color w:val="000000"/>
-                <w:kern w:val="0"/>
-                <w:sz w:val="22"/>
-                <w:szCs w:val="22"/>
-                <w:lang w:eastAsia="en-IN"/>
-                <w14:ligatures w14:val="none"/>
-              </w:rPr>
-              <w:t>Car fuel and Maintenance Allowance</w:t>
-            </w:r>
-          </w:p>
-        </w:tc>
-        <w:tc>
-          <w:tcPr>
-            <w:tcW w:w="1961" w:type="dxa"/>
-            <w:tcBorders>
-              <w:top w:val="nil"/>
-              <w:left w:val="nil"/>
-              <w:bottom w:val="nil"/>
-              <w:right w:val="single" w:sz="4" w:space="0" w:color="auto"/>
-            </w:tcBorders>
-            <w:noWrap/>
-            <w:vAlign w:val="center"/>
-          </w:tcPr>
-          <w:p>
-            <w:pPr>
-              <w:spacing w:after="0" w:line="240" w:lineRule="auto"/>
-              <w:jc w:val="center"/>
-              <w:rPr>
-                <w:rFonts w:ascii="Calibri" w:eastAsia="Times New Roman" w:hAnsi="Calibri" w:cs="Calibri"/>
-                <w:color w:val="000000"/>
-                <w:kern w:val="0"/>
-                <w:sz w:val="22"/>
-                <w:szCs w:val="22"/>
-                <w:lang w:eastAsia="en-IN"/>
-                <w14:ligatures w14:val="none"/>
-              </w:rPr>
-            </w:pPr>
-            <w:r>
-              <w:t>{{salary_car_fuel_and_maintenance_allowance_monthly}}</w:t>
-            </w:r>
-          </w:p>
-        </w:tc>
-        <w:tc>
-          <w:tcPr>
-            <w:tcW w:w="1940" w:type="dxa"/>
-            <w:tcBorders>
-              <w:top w:val="nil"/>
-              <w:left w:val="nil"/>
-              <w:bottom w:val="nil"/>
-              <w:right w:val="single" w:sz="8" w:space="0" w:color="auto"/>
-            </w:tcBorders>
-            <w:noWrap/>
-            <w:vAlign w:val="center"/>
-          </w:tcPr>
-          <w:p>
-            <w:pPr>
-              <w:spacing w:after="0" w:line="240" w:lineRule="auto"/>
-              <w:jc w:val="center"/>
-              <w:rPr>
-                <w:rFonts w:ascii="Calibri" w:eastAsia="Times New Roman" w:hAnsi="Calibri" w:cs="Calibri"/>
-                <w:color w:val="000000"/>
-                <w:kern w:val="0"/>
-                <w:sz w:val="22"/>
-                <w:szCs w:val="22"/>
-                <w:lang w:eastAsia="en-IN"/>
-                <w14:ligatures w14:val="none"/>
-              </w:rPr>
-            </w:pPr>
-            <w:r>
-              <w:t>{{salary_car_fuel_and_maintenance_allowance_annual}}</w:t>
             </w:r>
           </w:p>
         </w:tc>

</xml_diff>